<commit_message>
Add repository link to manuscript and Supporting Information
Data availability now points to the GitHub repository, notes it will be made
public and archived with a DOI on acceptance, and states the LTEM T4 data is
available on request.

Co-Authored-By: Claude Opus 4.8 <noreply@anthropic.com>
</commit_message>
<xml_diff>
--- a/manuscript/Supporting_Information_AI_Skills_Reproducibility_MEE.docx
+++ b/manuscript/Supporting_Information_AI_Skills_Reproducibility_MEE.docx
@@ -27501,6 +27501,20 @@
           <w:szCs w:val="22"/>
         </w:rPr>
         <w:t xml:space="preserve">prompts_r.py regenerate the prompt files; data/ holds the three input CSV files.</w:t>
+      </w:r>
+    </w:p>
+    <w:p>
+      <w:pPr>
+        <w:spacing w:after="120" w:before="100" w:line="336"/>
+      </w:pPr>
+      <w:r>
+        <w:rPr>
+          <w:rFonts w:ascii="Helvetica" w:cs="Helvetica" w:eastAsia="Helvetica" w:hAnsi="Helvetica"/>
+          <w:color w:val="1F2937"/>
+          <w:sz w:val="22"/>
+          <w:szCs w:val="22"/>
+        </w:rPr>
+        <w:t xml:space="preserve">These materials are in the Git repository https://github.com/Fabbiologia/ai-skills-reproducibility-ecology (made public and archived with a DOI on acceptance). The restricted LTEM reef-fish file for Task T4 is not distributed there and is available on request from the Aburto Lab.</w:t>
       </w:r>
     </w:p>
     <w:p>

</xml_diff>